<commit_message>
this is first push
</commit_message>
<xml_diff>
--- a/practisefile.docx
+++ b/practisefile.docx
@@ -4,7 +4,19 @@
   <w:body>
     <w:p>
       <w:r>
-        <w:t xml:space="preserve">Hi This changes are being made on your local machine. </w:t>
+        <w:t xml:space="preserve">Hi </w:t>
+      </w:r>
+      <w:proofErr w:type="gramStart"/>
+      <w:r>
+        <w:t>This</w:t>
+      </w:r>
+      <w:proofErr w:type="gramEnd"/>
+      <w:r>
+        <w:t xml:space="preserve"> changes are being made on your local machine. </w:t>
+      </w:r>
+      <w:r>
+        <w:br/>
+        <w:t>This is change 2 Made on git local machine.</w:t>
       </w:r>
     </w:p>
     <w:sectPr>

</xml_diff>